<commit_message>
Update resume + site copy: wrap up Visa, add GitHub Staff PM role
- Regenerated Harish.Raghavendra.04.2026.pdf (reportlab) and the DOCX resume
  with a new GitHub, a Microsoft Company section (title: Staff Product
  Manager, Data Platform) and an expanded/closed-out Visa section pulling
  GRC platform metrics and the seven-year retrospective.
- Updated homepage hero, experience section, timeline, and the 2026-present
  and 2026 year pages to use the Staff Product Manager, Data Platform title
  and past-tense Visa framing consistently across the site.

Co-authored-by: Copilot App <223556219+Copilot@users.noreply.github.com>
</commit_message>
<xml_diff>
--- a/public/resumes/Harish.Raghavendra.Resume.24.docx
+++ b/public/resumes/Harish.Raghavendra.Resume.24.docx
@@ -251,21 +251,19 @@
           <w:sz w:val="24"/>
           <w:szCs w:val="24"/>
         </w:rPr>
-        <w:t xml:space="preserve">Over 20+ </w:t>
-      </w:r>
-      <w:r>
-        <w:rPr>
-          <w:sz w:val="24"/>
-          <w:szCs w:val="24"/>
-        </w:rPr>
-        <w:t>years’ experience</w:t>
-      </w:r>
-      <w:r>
-        <w:rPr>
-          <w:sz w:val="24"/>
-          <w:szCs w:val="24"/>
-        </w:rPr>
-        <w:t xml:space="preserve"> in software engineering with focus on product companies specializing in Finance, Media, FinTech, Payments, Legal, and Manufacturing industries. Held multiple leadership roles including Product Management, Engineering manager, Technical Program manager, Team Lead, Application Architect, Scrum Master, Agile Coach with experience in hiring, managing &amp; improving product, and engineering teams in a variety of business applications. Experience delivering large scale complex solutions with various levels of ambiguity, </w:t>
+        <w:t>Staff Product Manager specializing in data platforms, developer platforms, and AI/agentic governance at global scale. 20+ years' experience across Product Management, Engineering Management, and Technical Program Management leading Data Services and Data Platform teams for billions of transactions and 100M+ scale entities, spanning Finance, Media, FinTech, Payments, Legal, and Manufacturing industries.</w:t>
+      </w:r>
+      <w:r>
+        <w:rPr>
+          <w:sz w:val="24"/>
+          <w:szCs w:val="24"/>
+        </w:rPr>
+      </w:r>
+      <w:r>
+        <w:rPr>
+          <w:sz w:val="24"/>
+          <w:szCs w:val="24"/>
+        </w:rPr>
       </w:r>
       <w:proofErr w:type="gramStart"/>
       <w:r>
@@ -273,7 +271,6 @@
           <w:sz w:val="24"/>
           <w:szCs w:val="24"/>
         </w:rPr>
-        <w:t>scope</w:t>
       </w:r>
       <w:proofErr w:type="gramEnd"/>
       <w:r>
@@ -281,7 +278,6 @@
           <w:sz w:val="24"/>
           <w:szCs w:val="24"/>
         </w:rPr>
-        <w:t xml:space="preserve"> and multiple groups. Extremely good analytical skills and ability to break down complex requirements to manageable concrete deliverables. </w:t>
       </w:r>
     </w:p>
     <w:p>
@@ -429,6 +425,59 @@
     <w:p>
       <w:pPr>
         <w:pStyle w:val="Heading6"/>
+      </w:pPr>
+      <w:r>
+        <w:t>GITHUB, A MICROSOFT COMPANY - Remote                                                   2026 - Present</w:t>
+      </w:r>
+    </w:p>
+    <w:p>
+      <w:r>
+        <w:rPr>
+          <w:b/>
+        </w:rPr>
+        <w:t>Staff Product Manager, Data Platform</w:t>
+      </w:r>
+    </w:p>
+    <w:p>
+      <w:r>
+        <w:t>Leading Product Management of Data Services and the Data Platform at GitHub scale, bringing seven years of self-service, AI-native platform experience and agentic governance delivery from Visa to developer tooling used by millions of builders.</w:t>
+      </w:r>
+    </w:p>
+    <w:p>
+      <w:pPr>
+        <w:pStyle w:val="ListParagraph"/>
+      </w:pPr>
+      <w:r>
+        <w:t>Leading Product Management for Data Services &amp; Data Platform, setting direction for how GitHub's data infrastructure and platform APIs scale to serve its global developer and enterprise customer base.</w:t>
+      </w:r>
+    </w:p>
+    <w:p>
+      <w:pPr>
+        <w:pStyle w:val="ListParagraph"/>
+      </w:pPr>
+      <w:r>
+        <w:t>Bringing forward self-service platform thinking (Parsec), scaling foundational infrastructure with trust and audit-readiness (Tusker), and direct experience shipping a production-grade agentic AI platform with 30-50 collaborating agents (ViDA.AI) - where automation and human judgment compose rather than compete.</w:t>
+      </w:r>
+    </w:p>
+    <w:p>
+      <w:pPr>
+        <w:pStyle w:val="ListParagraph"/>
+      </w:pPr>
+      <w:r>
+        <w:t>Partnering across Engineering, Data, and Platform teams to bring a governance-and-trust lens to data platform decisions without slowing down builders operating at GitHub scale.</w:t>
+      </w:r>
+    </w:p>
+    <w:p>
+      <w:pPr>
+        <w:pStyle w:val="ListParagraph"/>
+      </w:pPr>
+      <w:r>
+        <w:t>Ramping on GitHub's platform surface area and a builder community at a scale beyond any internal enterprise platform, translating that context into a near-term data platform roadmap.</w:t>
+      </w:r>
+    </w:p>
+    <w:p>
+      <w:pPr>
+        <w:pStyle w:val="Heading6"/>
         <w:ind w:left="100" w:firstLine="0"/>
         <w:rPr>
           <w:sz w:val="28"/>
@@ -499,7 +548,7 @@
           <w:szCs w:val="28"/>
         </w:rPr>
         <w:tab/>
-        <w:t xml:space="preserve">        2019 - Current  </w:t>
+        <w:t xml:space="preserve">        2019 - 2026  </w:t>
       </w:r>
     </w:p>
     <w:p>
@@ -519,7 +568,7 @@
           <w:sz w:val="26"/>
           <w:szCs w:val="26"/>
         </w:rPr>
-        <w:t>Director of Product Management, Data Platform</w:t>
+        <w:t>Director, Data and AI Governance</w:t>
       </w:r>
     </w:p>
     <w:p>
@@ -537,21 +586,19 @@
           <w:sz w:val="22"/>
           <w:szCs w:val="22"/>
         </w:rPr>
-        <w:t xml:space="preserve">Presently leading next generation of Merchant Data Platform. </w:t>
-      </w:r>
-      <w:r>
-        <w:rPr>
-          <w:sz w:val="22"/>
-          <w:szCs w:val="22"/>
-        </w:rPr>
-        <w:t>Lead</w:t>
-      </w:r>
-      <w:r>
-        <w:rPr>
-          <w:sz w:val="22"/>
-          <w:szCs w:val="22"/>
-        </w:rPr>
-        <w:t xml:space="preserve"> </w:t>
+        <w:t xml:space="preserve">Led next generation of Merchant Data Platform. Led Open source services adoption of Big Data Platform at Visa at 100s of petabytes scale. Technical Product ownership of Data Platform as a Service (PaaS) roadmaps. People manager of Technical Product Management team in areas of MLP, Core Data, Platform Services and Hadoop Ecosystem. As a Product leader led critical products (MDP, Parsec, and Tusker) setting product direction for the next 5 years.  </w:t>
+      </w:r>
+      <w:r>
+        <w:rPr>
+          <w:sz w:val="22"/>
+          <w:szCs w:val="22"/>
+        </w:rPr>
+      </w:r>
+      <w:r>
+        <w:rPr>
+          <w:sz w:val="22"/>
+          <w:szCs w:val="22"/>
+        </w:rPr>
       </w:r>
       <w:proofErr w:type="gramStart"/>
       <w:r>
@@ -559,7 +606,6 @@
           <w:sz w:val="22"/>
           <w:szCs w:val="22"/>
         </w:rPr>
-        <w:t>Open source</w:t>
       </w:r>
       <w:proofErr w:type="gramEnd"/>
       <w:r>
@@ -567,49 +613,42 @@
           <w:sz w:val="22"/>
           <w:szCs w:val="22"/>
         </w:rPr>
-        <w:t xml:space="preserve"> services adoption of Big Data Platform at Visa at 100s of petabytes scale. Technical Product ownership of </w:t>
-      </w:r>
-      <w:r>
-        <w:rPr>
-          <w:sz w:val="22"/>
-          <w:szCs w:val="22"/>
-        </w:rPr>
-        <w:t xml:space="preserve">Data </w:t>
-      </w:r>
-      <w:r>
-        <w:rPr>
-          <w:sz w:val="22"/>
-          <w:szCs w:val="22"/>
-        </w:rPr>
-        <w:t xml:space="preserve">Platform as a Service (PaaS) roadmaps. People manager of Technical Product Management team in areas of MLP, Core Data, Platform Services and Hadoop Ecosystem. As a Product leader </w:t>
-      </w:r>
-      <w:r>
-        <w:rPr>
-          <w:sz w:val="22"/>
-          <w:szCs w:val="22"/>
-        </w:rPr>
-        <w:t xml:space="preserve">led </w:t>
-      </w:r>
-      <w:r>
-        <w:rPr>
-          <w:sz w:val="22"/>
-          <w:szCs w:val="22"/>
-        </w:rPr>
-        <w:t>critical products (</w:t>
-      </w:r>
-      <w:r>
-        <w:rPr>
-          <w:sz w:val="22"/>
-          <w:szCs w:val="22"/>
-        </w:rPr>
-        <w:t xml:space="preserve">MDP, </w:t>
-      </w:r>
-      <w:r>
-        <w:rPr>
-          <w:sz w:val="22"/>
-          <w:szCs w:val="22"/>
-        </w:rPr>
-        <w:t xml:space="preserve">Parsec, and Tusker) setting product direction for the next 5 years.  </w:t>
+      </w:r>
+      <w:r>
+        <w:rPr>
+          <w:sz w:val="22"/>
+          <w:szCs w:val="22"/>
+        </w:rPr>
+      </w:r>
+      <w:r>
+        <w:rPr>
+          <w:sz w:val="22"/>
+          <w:szCs w:val="22"/>
+        </w:rPr>
+      </w:r>
+      <w:r>
+        <w:rPr>
+          <w:sz w:val="22"/>
+          <w:szCs w:val="22"/>
+        </w:rPr>
+      </w:r>
+      <w:r>
+        <w:rPr>
+          <w:sz w:val="22"/>
+          <w:szCs w:val="22"/>
+        </w:rPr>
+      </w:r>
+      <w:r>
+        <w:rPr>
+          <w:sz w:val="22"/>
+          <w:szCs w:val="22"/>
+        </w:rPr>
+      </w:r>
+      <w:r>
+        <w:rPr>
+          <w:sz w:val="22"/>
+          <w:szCs w:val="22"/>
+        </w:rPr>
       </w:r>
     </w:p>
     <w:p>
@@ -1296,6 +1335,11 @@
           <w:highlight w:val="white"/>
         </w:rPr>
         <w:t>Developed the Parsec App Builder, a NodeJS framework, to enable the creation of complete end-to-end applications.</w:t>
+      </w:r>
+    </w:p>
+    <w:p>
+      <w:r>
+        <w:t>Closing chapter: Left Visa in August 2026 after seven years spent taking ideas from 0-to-1 and carrying them to 1-to-100 across Parsec, Tusker, the NextGen Merchant Data Platform, and ViDA.AI - which continues on, carried forward into Visa's next-generation risk-agent tool chain.</w:t>
       </w:r>
     </w:p>
     <w:p>

</xml_diff>